<commit_message>
Deploy DocTranslate application to Hugging Face Spaces
</commit_message>
<xml_diff>
--- a/tests/uploaded_translated.docx
+++ b/tests/uploaded_translated.docx
@@ -27,18 +27,19 @@
         <w:rPr>
           <w:b/>
         </w:rPr>
-        <w:t xml:space="preserve"> महत्वाची </w:t>
-      </w:r>
-      <w:r>
-        <w:t xml:space="preserve"> सूचना आहे. नोंदणी प्रक्रियेदरम्यान कोणताही गोंधळ टाळण्यासाठी कृपया </w:t>
+        <w:t xml:space="preserve"> महत्वाची सूचना आहे. नोंदणी प्रक्रियेदरम्यान कोणताही गोंधळ टाळण्यासाठी कृपया </w:t>
       </w:r>
       <w:r>
         <w:rPr>
+          <w:b/>
           <w:i/>
         </w:rPr>
         <w:t xml:space="preserve"> सूचना </w:t>
       </w:r>
       <w:r>
+        <w:rPr>
+          <w:b/>
+        </w:rPr>
         <w:t xml:space="preserve"> काळजीपूर्वक वाचा.</w:t>
       </w:r>
     </w:p>
@@ -75,7 +76,7 @@
     <w:p>
       <w:r/>
       <w:r>
-        <w:t>कॅम्पस परिसरात कोणत्याही बाह्य वाहनांना प्रवेश दिला जाणार नाही.</w:t>
+        <w:t>कोणत्याही बाह्य वाहनांना परिसराच्या आत प्रवेश दिला जाणार नाही.</w:t>
       </w:r>
     </w:p>
     <w:p>

</xml_diff>